<commit_message>
modified:   site/Eurorack/310c-Diode-Voltage-Controlled-Filter/Files/310c-Rev.1.docx 	modified:   site/Eurorack/310c-Diode-Voltage-Controlled-Filter/Files/310c-Rev.1.pdf 	modified:   site/Eurorack/310c-Diode-Voltage-Controlled-Filter/Files/~$0c-Rev.1.docx 	modified:   site/Eurorack/310c-Diode-Voltage-Controlled-Filter/Manual/index.html 	modified:   site/index.html 	modified:   site/search/search_index.json 	modified:   site/sitemap.xml.gz
</commit_message>
<xml_diff>
--- a/site/Eurorack/310c-Diode-Voltage-Controlled-Filter/Files/310c-Rev.1.docx
+++ b/site/Eurorack/310c-Diode-Voltage-Controlled-Filter/Files/310c-Rev.1.docx
@@ -217,6 +217,15 @@
           <w:lang w:val="en-US"/>
         </w:rPr>
       </w:pPr>
+    </w:p>
+    <w:p>
+      <w:pPr>
+        <w:spacing w:line="360" w:lineRule="auto"/>
+        <w:rPr>
+          <w:rFonts w:ascii="Times New Roman" w:hAnsi="Times New Roman" w:cs="Times New Roman"/>
+          <w:lang w:val="en-US"/>
+        </w:rPr>
+      </w:pPr>
       <w:r>
         <w:rPr>
           <w:rFonts w:ascii="Times New Roman" w:hAnsi="Times New Roman" w:cs="Times New Roman"/>
@@ -615,7 +624,6 @@
           <w:u w:val="single"/>
           <w:lang w:val="en-US"/>
         </w:rPr>
-        <w:lastRenderedPageBreak/>
         <w:drawing>
           <wp:anchor distT="0" distB="0" distL="114300" distR="114300" simplePos="0" relativeHeight="251658240" behindDoc="0" locked="0" layoutInCell="1" allowOverlap="1" wp14:anchorId="0A3E80F6" wp14:editId="59EEDE75">
             <wp:simplePos x="0" y="0"/>
@@ -865,14 +873,7 @@
           <w:rFonts w:ascii="Times New Roman" w:hAnsi="Times New Roman" w:cs="Times New Roman"/>
           <w:lang w:val="en-US"/>
         </w:rPr>
-        <w:t xml:space="preserve">inputs both accept </w:t>
-      </w:r>
-      <w:r>
-        <w:rPr>
-          <w:rFonts w:ascii="Times New Roman" w:hAnsi="Times New Roman" w:cs="Times New Roman"/>
-          <w:lang w:val="en-US"/>
-        </w:rPr>
-        <w:t xml:space="preserve">standard </w:t>
+        <w:t xml:space="preserve">inputs both accept standard </w:t>
       </w:r>
       <w:proofErr w:type="spellStart"/>
       <w:r>
@@ -1286,14 +1287,7 @@
           <w:rFonts w:ascii="Times New Roman" w:hAnsi="Times New Roman" w:cs="Times New Roman"/>
           <w:lang w:val="en-US"/>
         </w:rPr>
-        <w:t xml:space="preserve"> to monitor the output of the module. Next, remove the module from the rack and locate the resonance trimmer on the bottom PCB (see fig. 4.1). Using a small flathead screwdriver, </w:t>
-      </w:r>
-      <w:r>
-        <w:rPr>
-          <w:rFonts w:ascii="Times New Roman" w:hAnsi="Times New Roman" w:cs="Times New Roman"/>
-          <w:lang w:val="en-US"/>
-        </w:rPr>
-        <w:t xml:space="preserve">adjust the frequency </w:t>
+        <w:t xml:space="preserve"> to monitor the </w:t>
       </w:r>
       <w:r>
         <w:rPr>
@@ -1301,7 +1295,14 @@
           <w:lang w:val="en-US"/>
         </w:rPr>
         <w:lastRenderedPageBreak/>
-        <w:t xml:space="preserve">trimmer to your liking. The output of the resonance will be the resonance of the module with maximum resonance. </w:t>
+        <w:t xml:space="preserve">output of the module. Next, remove the module from the rack and locate the resonance trimmer on the bottom PCB (see fig. 4.1). Using a small flathead screwdriver, </w:t>
+      </w:r>
+      <w:r>
+        <w:rPr>
+          <w:rFonts w:ascii="Times New Roman" w:hAnsi="Times New Roman" w:cs="Times New Roman"/>
+          <w:lang w:val="en-US"/>
+        </w:rPr>
+        <w:t xml:space="preserve">adjust the frequency trimmer to your liking. The output of the resonance will be the resonance of the module with maximum resonance. </w:t>
       </w:r>
     </w:p>
     <w:p>
@@ -1509,7 +1510,21 @@
           <w:rFonts w:ascii="Times New Roman" w:hAnsi="Times New Roman" w:cs="Times New Roman"/>
           <w:lang w:val="en-US"/>
         </w:rPr>
-        <w:t xml:space="preserve">As this module is a very basic module without complicated functionality, creative uses for it are limited other than the standard VCF. </w:t>
+        <w:t xml:space="preserve">As this module is a very basic module without complicated functionality, creative uses for it are </w:t>
+      </w:r>
+      <w:r>
+        <w:rPr>
+          <w:rFonts w:ascii="Times New Roman" w:hAnsi="Times New Roman" w:cs="Times New Roman"/>
+          <w:lang w:val="en-US"/>
+        </w:rPr>
+        <w:t xml:space="preserve">rather </w:t>
+      </w:r>
+      <w:r>
+        <w:rPr>
+          <w:rFonts w:ascii="Times New Roman" w:hAnsi="Times New Roman" w:cs="Times New Roman"/>
+          <w:lang w:val="en-US"/>
+        </w:rPr>
+        <w:t xml:space="preserve">limited other than the standard VCF. </w:t>
       </w:r>
     </w:p>
     <w:p>
@@ -1545,7 +1560,510 @@
           <w:rFonts w:ascii="Times New Roman" w:hAnsi="Times New Roman" w:cs="Times New Roman"/>
           <w:lang w:val="en-US"/>
         </w:rPr>
-        <w:t xml:space="preserve">Filter pinging (percussions, kicks, </w:t>
+        <w:t xml:space="preserve">When </w:t>
+      </w:r>
+      <w:r>
+        <w:rPr>
+          <w:rFonts w:ascii="Times New Roman" w:hAnsi="Times New Roman" w:cs="Times New Roman"/>
+          <w:lang w:val="en-US"/>
+        </w:rPr>
+        <w:t>triggers are patched into</w:t>
+      </w:r>
+      <w:r>
+        <w:rPr>
+          <w:rFonts w:ascii="Times New Roman" w:hAnsi="Times New Roman" w:cs="Times New Roman"/>
+          <w:lang w:val="en-US"/>
+        </w:rPr>
+        <w:t xml:space="preserve"> the filter while</w:t>
+      </w:r>
+      <w:r>
+        <w:rPr>
+          <w:rFonts w:ascii="Times New Roman" w:hAnsi="Times New Roman" w:cs="Times New Roman" w:hint="eastAsia"/>
+          <w:lang w:val="en-US"/>
+        </w:rPr>
+        <w:t xml:space="preserve"> </w:t>
+      </w:r>
+      <w:r>
+        <w:rPr>
+          <w:rFonts w:ascii="Times New Roman" w:hAnsi="Times New Roman" w:cs="Times New Roman"/>
+          <w:lang w:val="en-US"/>
+        </w:rPr>
+        <w:t xml:space="preserve">the </w:t>
+      </w:r>
+      <w:r>
+        <w:rPr>
+          <w:rFonts w:ascii="Times New Roman" w:hAnsi="Times New Roman" w:cs="Times New Roman"/>
+          <w:b/>
+          <w:bCs/>
+          <w:lang w:val="en-US"/>
+        </w:rPr>
+        <w:t xml:space="preserve">RESONANCE </w:t>
+      </w:r>
+      <w:r>
+        <w:rPr>
+          <w:rFonts w:ascii="Times New Roman" w:hAnsi="Times New Roman" w:cs="Times New Roman" w:hint="eastAsia"/>
+          <w:lang w:val="en-US"/>
+        </w:rPr>
+        <w:t>is</w:t>
+      </w:r>
+      <w:r>
+        <w:rPr>
+          <w:rFonts w:ascii="Times New Roman" w:hAnsi="Times New Roman" w:cs="Times New Roman"/>
+          <w:lang w:val="en-US"/>
+        </w:rPr>
+        <w:t xml:space="preserve"> right before self-oscillation,</w:t>
+      </w:r>
+      <w:r>
+        <w:rPr>
+          <w:rFonts w:ascii="Times New Roman" w:hAnsi="Times New Roman" w:cs="Times New Roman"/>
+          <w:lang w:val="en-US"/>
+        </w:rPr>
+        <w:t xml:space="preserve"> </w:t>
+      </w:r>
+      <w:r>
+        <w:rPr>
+          <w:rFonts w:ascii="Times New Roman" w:hAnsi="Times New Roman" w:cs="Times New Roman"/>
+          <w:lang w:val="en-US"/>
+        </w:rPr>
+        <w:t xml:space="preserve">the filter can be pinged, outputting a </w:t>
+      </w:r>
+      <w:r>
+        <w:rPr>
+          <w:rFonts w:ascii="Times New Roman" w:hAnsi="Times New Roman" w:cs="Times New Roman"/>
+          <w:lang w:val="en-US"/>
+        </w:rPr>
+        <w:t xml:space="preserve">short decaying sine pulse. The frequency of the ping is dependent on the cutoff </w:t>
+      </w:r>
+      <w:r>
+        <w:rPr>
+          <w:rFonts w:ascii="Times New Roman" w:hAnsi="Times New Roman" w:cs="Times New Roman"/>
+          <w:b/>
+          <w:bCs/>
+          <w:lang w:val="en-US"/>
+        </w:rPr>
+        <w:t>FREQUENCY</w:t>
+      </w:r>
+      <w:r>
+        <w:rPr>
+          <w:rFonts w:ascii="Times New Roman" w:hAnsi="Times New Roman" w:cs="Times New Roman"/>
+          <w:lang w:val="en-US"/>
+        </w:rPr>
+        <w:t xml:space="preserve">, and the decay time can be slightly </w:t>
+      </w:r>
+      <w:r>
+        <w:rPr>
+          <w:rFonts w:ascii="Times New Roman" w:hAnsi="Times New Roman" w:cs="Times New Roman"/>
+          <w:lang w:val="en-US"/>
+        </w:rPr>
+        <w:t>adjusted</w:t>
+      </w:r>
+      <w:r>
+        <w:rPr>
+          <w:rFonts w:ascii="Times New Roman" w:hAnsi="Times New Roman" w:cs="Times New Roman"/>
+          <w:lang w:val="en-US"/>
+        </w:rPr>
+        <w:t xml:space="preserve"> using the </w:t>
+      </w:r>
+      <w:r>
+        <w:rPr>
+          <w:rFonts w:ascii="Times New Roman" w:hAnsi="Times New Roman" w:cs="Times New Roman"/>
+          <w:b/>
+          <w:bCs/>
+          <w:lang w:val="en-US"/>
+        </w:rPr>
+        <w:t>RESONANCE</w:t>
+      </w:r>
+      <w:r>
+        <w:rPr>
+          <w:rFonts w:ascii="Times New Roman" w:hAnsi="Times New Roman" w:cs="Times New Roman"/>
+          <w:lang w:val="en-US"/>
+        </w:rPr>
+        <w:t xml:space="preserve"> control. </w:t>
+      </w:r>
+    </w:p>
+    <w:p>
+      <w:pPr>
+        <w:spacing w:line="360" w:lineRule="auto"/>
+        <w:rPr>
+          <w:rFonts w:ascii="Times New Roman" w:hAnsi="Times New Roman" w:cs="Times New Roman"/>
+          <w:lang w:val="en-US"/>
+        </w:rPr>
+      </w:pPr>
+      <w:r>
+        <w:rPr>
+          <w:rFonts w:ascii="Times New Roman" w:hAnsi="Times New Roman" w:cs="Times New Roman"/>
+          <w:b/>
+          <w:bCs/>
+          <w:lang w:val="en-US"/>
+        </w:rPr>
+        <w:t>CV</w:t>
+      </w:r>
+      <w:r>
+        <w:rPr>
+          <w:rFonts w:ascii="Times New Roman" w:hAnsi="Times New Roman" w:cs="Times New Roman"/>
+          <w:lang w:val="en-US"/>
+        </w:rPr>
+        <w:t xml:space="preserve"> can be used to obtain more interesting results, try patching a simple decaying envelope to it to obtain a </w:t>
+      </w:r>
+      <w:r>
+        <w:rPr>
+          <w:rFonts w:ascii="Times New Roman" w:hAnsi="Times New Roman" w:cs="Times New Roman"/>
+          <w:lang w:val="en-US"/>
+        </w:rPr>
+        <w:t xml:space="preserve">pitch sweep, allowing the synthesis of kick drums or other percussive sounds. When an audio rate signal </w:t>
+      </w:r>
+      <w:r>
+        <w:rPr>
+          <w:rFonts w:ascii="Times New Roman" w:hAnsi="Times New Roman" w:cs="Times New Roman"/>
+          <w:lang w:val="en-US"/>
+        </w:rPr>
+        <w:t>is</w:t>
+      </w:r>
+      <w:r>
+        <w:rPr>
+          <w:rFonts w:ascii="Times New Roman" w:hAnsi="Times New Roman" w:cs="Times New Roman"/>
+          <w:lang w:val="en-US"/>
+        </w:rPr>
+        <w:t xml:space="preserve"> patched into </w:t>
+      </w:r>
+      <w:r>
+        <w:rPr>
+          <w:rFonts w:ascii="Times New Roman" w:hAnsi="Times New Roman" w:cs="Times New Roman"/>
+          <w:b/>
+          <w:bCs/>
+          <w:lang w:val="en-US"/>
+        </w:rPr>
+        <w:t>CV</w:t>
+      </w:r>
+      <w:r>
+        <w:rPr>
+          <w:rFonts w:ascii="Times New Roman" w:hAnsi="Times New Roman" w:cs="Times New Roman"/>
+          <w:lang w:val="en-US"/>
+        </w:rPr>
+        <w:t xml:space="preserve">, more complex sounds can be obtained, reminiscent of </w:t>
+      </w:r>
+      <w:r>
+        <w:rPr>
+          <w:rFonts w:ascii="Times New Roman" w:hAnsi="Times New Roman" w:cs="Times New Roman"/>
+          <w:i/>
+          <w:iCs/>
+          <w:lang w:val="en-US"/>
+        </w:rPr>
+        <w:t>Buchla Bongos</w:t>
+      </w:r>
+      <w:r>
+        <w:rPr>
+          <w:rFonts w:ascii="Times New Roman" w:hAnsi="Times New Roman" w:cs="Times New Roman"/>
+          <w:i/>
+          <w:iCs/>
+          <w:lang w:val="en-US"/>
+        </w:rPr>
+        <w:t xml:space="preserve"> </w:t>
+      </w:r>
+      <w:r>
+        <w:rPr>
+          <w:rFonts w:ascii="Times New Roman" w:hAnsi="Times New Roman" w:cs="Times New Roman"/>
+          <w:lang w:val="en-US"/>
+        </w:rPr>
+        <w:t xml:space="preserve">and the likes. </w:t>
+      </w:r>
+    </w:p>
+    <w:p>
+      <w:pPr>
+        <w:spacing w:line="360" w:lineRule="auto"/>
+        <w:rPr>
+          <w:rFonts w:ascii="Times New Roman" w:hAnsi="Times New Roman" w:cs="Times New Roman"/>
+          <w:lang w:val="en-US"/>
+        </w:rPr>
+      </w:pPr>
+      <w:r>
+        <w:rPr>
+          <w:rFonts w:ascii="Times New Roman" w:hAnsi="Times New Roman" w:cs="Times New Roman"/>
+          <w:lang w:val="en-US"/>
+        </w:rPr>
+        <w:lastRenderedPageBreak/>
+        <w:t xml:space="preserve">Experiment with the combinations of </w:t>
+      </w:r>
+      <w:r>
+        <w:rPr>
+          <w:rFonts w:ascii="Times New Roman" w:hAnsi="Times New Roman" w:cs="Times New Roman"/>
+          <w:b/>
+          <w:bCs/>
+          <w:lang w:val="en-US"/>
+        </w:rPr>
+        <w:t>IN</w:t>
+      </w:r>
+      <w:r>
+        <w:rPr>
+          <w:rFonts w:ascii="Times New Roman" w:hAnsi="Times New Roman" w:cs="Times New Roman"/>
+          <w:lang w:val="en-US"/>
+        </w:rPr>
+        <w:t xml:space="preserve"> and </w:t>
+      </w:r>
+      <w:r>
+        <w:rPr>
+          <w:rFonts w:ascii="Times New Roman" w:hAnsi="Times New Roman" w:cs="Times New Roman"/>
+          <w:b/>
+          <w:bCs/>
+          <w:lang w:val="en-US"/>
+        </w:rPr>
+        <w:t>CV</w:t>
+      </w:r>
+      <w:r>
+        <w:rPr>
+          <w:rFonts w:ascii="Times New Roman" w:hAnsi="Times New Roman" w:cs="Times New Roman"/>
+          <w:lang w:val="en-US"/>
+        </w:rPr>
+        <w:t xml:space="preserve"> inputs, for example a decaying envelope into </w:t>
+      </w:r>
+      <w:r>
+        <w:rPr>
+          <w:rFonts w:ascii="Times New Roman" w:hAnsi="Times New Roman" w:cs="Times New Roman"/>
+          <w:b/>
+          <w:bCs/>
+          <w:lang w:val="en-US"/>
+        </w:rPr>
+        <w:t xml:space="preserve">IN </w:t>
+      </w:r>
+      <w:r>
+        <w:rPr>
+          <w:rFonts w:ascii="Times New Roman" w:hAnsi="Times New Roman" w:cs="Times New Roman"/>
+          <w:lang w:val="en-US"/>
+        </w:rPr>
+        <w:t xml:space="preserve">and a trigger into </w:t>
+      </w:r>
+      <w:r>
+        <w:rPr>
+          <w:rFonts w:ascii="Times New Roman" w:hAnsi="Times New Roman" w:cs="Times New Roman"/>
+          <w:b/>
+          <w:bCs/>
+          <w:lang w:val="en-US"/>
+        </w:rPr>
+        <w:t>CV</w:t>
+      </w:r>
+      <w:r>
+        <w:rPr>
+          <w:rFonts w:ascii="Times New Roman" w:hAnsi="Times New Roman" w:cs="Times New Roman"/>
+          <w:lang w:val="en-US"/>
+        </w:rPr>
+        <w:t>.</w:t>
+      </w:r>
+      <w:r>
+        <w:rPr>
+          <w:rFonts w:ascii="Times New Roman" w:hAnsi="Times New Roman" w:cs="Times New Roman"/>
+          <w:lang w:val="en-US"/>
+        </w:rPr>
+        <w:t xml:space="preserve"> Also, experiment with combining different signals in an external mixer to obtain complex</w:t>
+      </w:r>
+      <w:r>
+        <w:rPr>
+          <w:rFonts w:ascii="Times New Roman" w:hAnsi="Times New Roman" w:cs="Times New Roman"/>
+          <w:lang w:val="en-US"/>
+        </w:rPr>
+        <w:t xml:space="preserve"> modulation. </w:t>
+      </w:r>
+    </w:p>
+    <w:p>
+      <w:pPr>
+        <w:spacing w:line="360" w:lineRule="auto"/>
+        <w:rPr>
+          <w:rFonts w:ascii="Times New Roman" w:hAnsi="Times New Roman" w:cs="Times New Roman"/>
+          <w:b/>
+          <w:bCs/>
+          <w:lang w:val="en-US"/>
+        </w:rPr>
+      </w:pPr>
+      <w:r>
+        <w:rPr>
+          <w:rFonts w:ascii="Times New Roman" w:hAnsi="Times New Roman" w:cs="Times New Roman"/>
+          <w:b/>
+          <w:bCs/>
+          <w:lang w:val="en-US"/>
+        </w:rPr>
+        <w:t>5.2 Sine VCO</w:t>
+      </w:r>
+    </w:p>
+    <w:p>
+      <w:pPr>
+        <w:spacing w:line="360" w:lineRule="auto"/>
+        <w:rPr>
+          <w:rFonts w:ascii="Times New Roman" w:hAnsi="Times New Roman" w:cs="Times New Roman"/>
+          <w:lang w:val="en-US"/>
+        </w:rPr>
+      </w:pPr>
+      <w:r>
+        <w:rPr>
+          <w:rFonts w:ascii="Times New Roman" w:hAnsi="Times New Roman" w:cs="Times New Roman"/>
+          <w:lang w:val="en-US"/>
+        </w:rPr>
+        <w:t xml:space="preserve">When </w:t>
+      </w:r>
+      <w:r>
+        <w:rPr>
+          <w:rFonts w:ascii="Times New Roman" w:hAnsi="Times New Roman" w:cs="Times New Roman"/>
+          <w:b/>
+          <w:bCs/>
+          <w:lang w:val="en-US"/>
+        </w:rPr>
+        <w:t>RESONANCE</w:t>
+      </w:r>
+      <w:r>
+        <w:rPr>
+          <w:rFonts w:ascii="Times New Roman" w:hAnsi="Times New Roman" w:cs="Times New Roman"/>
+          <w:lang w:val="en-US"/>
+        </w:rPr>
+        <w:t xml:space="preserve"> is pushed into self-oscillation, it outputs a sine wave with relatively low distortion</w:t>
+      </w:r>
+      <w:r>
+        <w:rPr>
+          <w:rStyle w:val="FootnoteReference"/>
+          <w:rFonts w:ascii="Times New Roman" w:hAnsi="Times New Roman" w:cs="Times New Roman"/>
+          <w:lang w:val="en-US"/>
+        </w:rPr>
+        <w:footnoteReference w:id="2"/>
+      </w:r>
+      <w:r>
+        <w:rPr>
+          <w:rFonts w:ascii="Times New Roman" w:hAnsi="Times New Roman" w:cs="Times New Roman"/>
+          <w:lang w:val="en-US"/>
+        </w:rPr>
+        <w:t xml:space="preserve">. Therefore, the </w:t>
+      </w:r>
+      <w:r>
+        <w:rPr>
+          <w:rFonts w:ascii="Times New Roman" w:hAnsi="Times New Roman" w:cs="Times New Roman"/>
+          <w:b/>
+          <w:bCs/>
+          <w:lang w:val="en-US"/>
+        </w:rPr>
+        <w:t>CV</w:t>
+      </w:r>
+      <w:r>
+        <w:rPr>
+          <w:rFonts w:ascii="Times New Roman" w:hAnsi="Times New Roman" w:cs="Times New Roman"/>
+          <w:lang w:val="en-US"/>
+        </w:rPr>
+        <w:t xml:space="preserve"> input can be used as a frequency modulation input of sorts, and when the </w:t>
+      </w:r>
+      <w:r>
+        <w:rPr>
+          <w:rFonts w:ascii="Times New Roman" w:hAnsi="Times New Roman" w:cs="Times New Roman"/>
+          <w:b/>
+          <w:bCs/>
+          <w:lang w:val="en-US"/>
+        </w:rPr>
+        <w:t>CV</w:t>
+      </w:r>
+      <w:r>
+        <w:rPr>
+          <w:rFonts w:ascii="Times New Roman" w:hAnsi="Times New Roman" w:cs="Times New Roman"/>
+          <w:lang w:val="en-US"/>
+        </w:rPr>
+        <w:t xml:space="preserve"> </w:t>
+      </w:r>
+      <w:r>
+        <w:rPr>
+          <w:rFonts w:ascii="Times New Roman" w:hAnsi="Times New Roman" w:cs="Times New Roman"/>
+          <w:lang w:val="en-US"/>
+        </w:rPr>
+        <w:t>a</w:t>
+      </w:r>
+      <w:r>
+        <w:rPr>
+          <w:rFonts w:ascii="Times New Roman" w:hAnsi="Times New Roman" w:cs="Times New Roman"/>
+          <w:lang w:val="en-US"/>
+        </w:rPr>
+        <w:t>ttenuator</w:t>
+      </w:r>
+      <w:r>
+        <w:rPr>
+          <w:rFonts w:ascii="Times New Roman" w:hAnsi="Times New Roman" w:cs="Times New Roman"/>
+          <w:lang w:val="en-US"/>
+        </w:rPr>
+        <w:t xml:space="preserve"> </w:t>
+      </w:r>
+      <w:r>
+        <w:rPr>
+          <w:rFonts w:ascii="Times New Roman" w:hAnsi="Times New Roman" w:cs="Times New Roman"/>
+          <w:lang w:val="en-US"/>
+        </w:rPr>
+        <w:t xml:space="preserve">is adjusted correctly, the </w:t>
+      </w:r>
+      <w:r>
+        <w:rPr>
+          <w:rFonts w:ascii="Times New Roman" w:hAnsi="Times New Roman" w:cs="Times New Roman"/>
+          <w:b/>
+          <w:bCs/>
+          <w:lang w:val="en-US"/>
+        </w:rPr>
+        <w:t>CV</w:t>
+      </w:r>
+      <w:r>
+        <w:rPr>
+          <w:rFonts w:ascii="Times New Roman" w:hAnsi="Times New Roman" w:cs="Times New Roman"/>
+          <w:lang w:val="en-US"/>
+        </w:rPr>
+        <w:t xml:space="preserve"> input can be used for </w:t>
+      </w:r>
+      <m:oMath>
+        <m:r>
+          <w:rPr>
+            <w:rFonts w:ascii="Cambria Math" w:hAnsi="Cambria Math" w:cs="Times New Roman"/>
+            <w:lang w:val="en-US"/>
+          </w:rPr>
+          <m:t>1 V/oct</m:t>
+        </m:r>
+      </m:oMath>
+      <w:r>
+        <w:rPr>
+          <w:rFonts w:ascii="Times New Roman" w:hAnsi="Times New Roman" w:cs="Times New Roman"/>
+          <w:lang w:val="en-US"/>
+        </w:rPr>
+        <w:t xml:space="preserve"> tracking for a usable range (see Section 3)</w:t>
+      </w:r>
+      <w:r>
+        <w:rPr>
+          <w:rFonts w:ascii="Times New Roman" w:hAnsi="Times New Roman" w:cs="Times New Roman"/>
+          <w:lang w:val="en-US"/>
+        </w:rPr>
+        <w:t xml:space="preserve">. </w:t>
+      </w:r>
+      <w:r>
+        <w:rPr>
+          <w:rFonts w:ascii="Times New Roman" w:hAnsi="Times New Roman" w:cs="Times New Roman" w:hint="eastAsia"/>
+          <w:lang w:val="en-US"/>
+        </w:rPr>
+        <w:t>T</w:t>
+      </w:r>
+      <w:r>
+        <w:rPr>
+          <w:rFonts w:ascii="Times New Roman" w:hAnsi="Times New Roman" w:cs="Times New Roman"/>
+          <w:lang w:val="en-US"/>
+        </w:rPr>
+        <w:t>hus</w:t>
+      </w:r>
+      <w:r>
+        <w:rPr>
+          <w:rFonts w:ascii="Times New Roman" w:hAnsi="Times New Roman" w:cs="Times New Roman"/>
+          <w:lang w:val="en-US"/>
+        </w:rPr>
+        <w:t xml:space="preserve">, the filter can be used as a sine VCO. </w:t>
+      </w:r>
+    </w:p>
+    <w:p>
+      <w:pPr>
+        <w:spacing w:line="360" w:lineRule="auto"/>
+        <w:rPr>
+          <w:rFonts w:ascii="Times New Roman" w:hAnsi="Times New Roman" w:cs="Times New Roman"/>
+          <w:lang w:val="en-US"/>
+        </w:rPr>
+      </w:pPr>
+      <w:r>
+        <w:rPr>
+          <w:rFonts w:ascii="Times New Roman" w:hAnsi="Times New Roman" w:cs="Times New Roman"/>
+          <w:lang w:val="en-US"/>
+        </w:rPr>
+        <w:t xml:space="preserve">Experiment with </w:t>
       </w:r>
       <w:proofErr w:type="spellStart"/>
       <w:r>
@@ -1553,7 +2071,7 @@
           <w:rFonts w:ascii="Times New Roman" w:hAnsi="Times New Roman" w:cs="Times New Roman"/>
           <w:lang w:val="en-US"/>
         </w:rPr>
-        <w:t>etc</w:t>
+        <w:t>wavefolding</w:t>
       </w:r>
       <w:proofErr w:type="spellEnd"/>
       <w:r>
@@ -1561,7 +2079,37 @@
           <w:rFonts w:ascii="Times New Roman" w:hAnsi="Times New Roman" w:cs="Times New Roman"/>
           <w:lang w:val="en-US"/>
         </w:rPr>
-        <w:t>)</w:t>
+        <w:t xml:space="preserve"> the </w:t>
+      </w:r>
+      <w:r>
+        <w:rPr>
+          <w:rFonts w:ascii="Times New Roman" w:hAnsi="Times New Roman" w:cs="Times New Roman"/>
+          <w:lang w:val="en-US"/>
+        </w:rPr>
+        <w:t xml:space="preserve">sine wave, using it to modulate other controls, overdriving the signal, as they will all result in interesting results. Additionally, driving the initial signal by cranking </w:t>
+      </w:r>
+      <w:r>
+        <w:rPr>
+          <w:rFonts w:ascii="Times New Roman" w:hAnsi="Times New Roman" w:cs="Times New Roman"/>
+          <w:b/>
+          <w:bCs/>
+          <w:lang w:val="en-US"/>
+        </w:rPr>
+        <w:t>RESONANCE</w:t>
+      </w:r>
+      <w:r>
+        <w:rPr>
+          <w:rFonts w:ascii="Times New Roman" w:hAnsi="Times New Roman" w:cs="Times New Roman"/>
+          <w:lang w:val="en-US"/>
+        </w:rPr>
+        <w:t xml:space="preserve"> will produce an output of higher harmonic content, try filtering the driven output for other results. Note that</w:t>
+      </w:r>
+      <w:r>
+        <w:rPr>
+          <w:rFonts w:ascii="Times New Roman" w:hAnsi="Times New Roman" w:cs="Times New Roman"/>
+          <w:lang w:val="en-US"/>
+        </w:rPr>
+        <w:t xml:space="preserve"> the signal is hard-clipped, and may produce noisy and/or loud results. </w:t>
       </w:r>
     </w:p>
     <w:p>
@@ -1580,87 +2128,6 @@
           <w:rFonts w:ascii="Times New Roman" w:hAnsi="Times New Roman" w:cs="Times New Roman"/>
           <w:b/>
           <w:bCs/>
-          <w:lang w:val="en-US"/>
-        </w:rPr>
-      </w:pPr>
-      <w:r>
-        <w:rPr>
-          <w:rFonts w:ascii="Times New Roman" w:hAnsi="Times New Roman" w:cs="Times New Roman"/>
-          <w:b/>
-          <w:bCs/>
-          <w:lang w:val="en-US"/>
-        </w:rPr>
-        <w:t>5.2 Sine VCO</w:t>
-      </w:r>
-    </w:p>
-    <w:p>
-      <w:pPr>
-        <w:spacing w:line="360" w:lineRule="auto"/>
-        <w:rPr>
-          <w:rFonts w:ascii="Times New Roman" w:hAnsi="Times New Roman" w:cs="Times New Roman"/>
-          <w:lang w:val="en-US"/>
-        </w:rPr>
-      </w:pPr>
-      <w:r>
-        <w:rPr>
-          <w:rFonts w:ascii="Times New Roman" w:hAnsi="Times New Roman" w:cs="Times New Roman"/>
-          <w:lang w:val="en-US"/>
-        </w:rPr>
-        <w:t>Using filter as a sine VCO</w:t>
-      </w:r>
-    </w:p>
-    <w:p>
-      <w:pPr>
-        <w:spacing w:line="360" w:lineRule="auto"/>
-        <w:rPr>
-          <w:rFonts w:ascii="Times New Roman" w:hAnsi="Times New Roman" w:cs="Times New Roman"/>
-          <w:lang w:val="en-US"/>
-        </w:rPr>
-      </w:pPr>
-    </w:p>
-    <w:p>
-      <w:pPr>
-        <w:spacing w:line="360" w:lineRule="auto"/>
-        <w:rPr>
-          <w:rFonts w:ascii="Times New Roman" w:hAnsi="Times New Roman" w:cs="Times New Roman"/>
-          <w:lang w:val="en-US"/>
-        </w:rPr>
-      </w:pPr>
-    </w:p>
-    <w:p>
-      <w:pPr>
-        <w:spacing w:line="360" w:lineRule="auto"/>
-        <w:rPr>
-          <w:rFonts w:ascii="Times New Roman" w:hAnsi="Times New Roman" w:cs="Times New Roman"/>
-          <w:lang w:val="en-US"/>
-        </w:rPr>
-      </w:pPr>
-    </w:p>
-    <w:p>
-      <w:pPr>
-        <w:spacing w:line="360" w:lineRule="auto"/>
-        <w:rPr>
-          <w:rFonts w:ascii="Times New Roman" w:hAnsi="Times New Roman" w:cs="Times New Roman"/>
-          <w:lang w:val="en-US"/>
-        </w:rPr>
-      </w:pPr>
-    </w:p>
-    <w:p>
-      <w:pPr>
-        <w:spacing w:line="360" w:lineRule="auto"/>
-        <w:rPr>
-          <w:rFonts w:ascii="Times New Roman" w:hAnsi="Times New Roman" w:cs="Times New Roman"/>
-          <w:lang w:val="en-US"/>
-        </w:rPr>
-      </w:pPr>
-    </w:p>
-    <w:p>
-      <w:pPr>
-        <w:spacing w:line="360" w:lineRule="auto"/>
-        <w:rPr>
-          <w:rFonts w:ascii="Times New Roman" w:hAnsi="Times New Roman" w:cs="Times New Roman"/>
-          <w:b/>
-          <w:bCs/>
           <w:u w:val="single"/>
           <w:lang w:val="en-US"/>
         </w:rPr>
@@ -1673,7 +2140,6 @@
           <w:u w:val="single"/>
           <w:lang w:val="en-US"/>
         </w:rPr>
-        <w:lastRenderedPageBreak/>
         <w:t>6</w:t>
       </w:r>
       <w:r>
@@ -1988,7 +2454,7 @@
           <w:rFonts w:ascii="Times New Roman" w:hAnsi="Times New Roman" w:cs="Times New Roman"/>
           <w:lang w:val="en-US"/>
         </w:rPr>
-        <w:footnoteReference w:id="2"/>
+        <w:footnoteReference w:id="3"/>
       </w:r>
     </w:p>
     <w:tbl>
@@ -2299,7 +2765,7 @@
           <w:bCs/>
           <w:lang w:val="en-US"/>
         </w:rPr>
-        <w:t>6.3 Other Specifications (Optional)</w:t>
+        <w:t>6.3 Other Specifications</w:t>
       </w:r>
     </w:p>
     <w:sectPr>
@@ -2546,6 +3012,35 @@
     </w:p>
   </w:footnote>
   <w:footnote w:id="2">
+    <w:p>
+      <w:pPr>
+        <w:pStyle w:val="FootnoteText"/>
+        <w:rPr>
+          <w:rFonts w:ascii="Times New Roman" w:hAnsi="Times New Roman" w:cs="Times New Roman"/>
+        </w:rPr>
+      </w:pPr>
+      <w:r>
+        <w:rPr>
+          <w:rStyle w:val="FootnoteReference"/>
+          <w:rFonts w:ascii="Times New Roman" w:hAnsi="Times New Roman" w:cs="Times New Roman"/>
+        </w:rPr>
+        <w:footnoteRef/>
+      </w:r>
+      <w:r>
+        <w:rPr>
+          <w:rFonts w:ascii="Times New Roman" w:hAnsi="Times New Roman" w:cs="Times New Roman"/>
+        </w:rPr>
+        <w:t xml:space="preserve"> </w:t>
+      </w:r>
+      <w:r>
+        <w:rPr>
+          <w:rFonts w:ascii="Times New Roman" w:hAnsi="Times New Roman" w:cs="Times New Roman"/>
+        </w:rPr>
+        <w:t xml:space="preserve">Exact distortion of the sine waves has yet to be measured. </w:t>
+      </w:r>
+    </w:p>
+  </w:footnote>
+  <w:footnote w:id="3">
     <w:p>
       <w:pPr>
         <w:pStyle w:val="FootnoteText"/>
@@ -4363,7 +4858,7 @@
 </file>
 
 <file path=customXml/itemProps1.xml><?xml version="1.0" encoding="utf-8"?>
-<ds:datastoreItem xmlns:ds="http://schemas.openxmlformats.org/officeDocument/2006/customXml" ds:itemID="{F08B9D24-2C56-0F43-85B7-E73CA9420B5F}">
+<ds:datastoreItem xmlns:ds="http://schemas.openxmlformats.org/officeDocument/2006/customXml" ds:itemID="{1850AD39-D015-3246-BBDE-EC81FBE3A595}">
   <ds:schemaRefs>
     <ds:schemaRef ds:uri="http://schemas.openxmlformats.org/officeDocument/2006/bibliography"/>
   </ds:schemaRefs>

</xml_diff>